<commit_message>
Streamline GM special assessment policy to six concise sections.
Co-authored-by: liborvybral-collab <liborvybral-collab@users.noreply.github.com>
</commit_message>
<xml_diff>
--- a/docs/sops/总经理专项考核制度.docx
+++ b/docs/sops/总经理专项考核制度.docx
@@ -4,7 +4,7 @@
   <w:body>
     <w:p>
       <w:pPr>
-        <w:spacing w:before="120" w:after="360"/>
+        <w:spacing w:after="360"/>
         <w:jc w:val="center"/>
       </w:pPr>
       <w:r>
@@ -18,8 +18,7 @@
     </w:p>
     <w:p>
       <w:pPr>
-        <w:spacing w:before="280" w:after="160"/>
-        <w:jc w:val="left"/>
+        <w:spacing w:before="200" w:after="80"/>
       </w:pPr>
       <w:r>
         <w:rPr>
@@ -27,25 +26,12 @@
           <w:b/>
           <w:sz w:val="28"/>
         </w:rPr>
-        <w:t>第一部分  总则</w:t>
-      </w:r>
-    </w:p>
-    <w:p>
-      <w:pPr>
-        <w:spacing w:before="160" w:after="80"/>
-      </w:pPr>
-      <w:r>
-        <w:rPr>
-          <w:rFonts w:ascii="黑体" w:hAnsi="黑体" w:eastAsia="黑体"/>
-          <w:b/>
-          <w:sz w:val="24"/>
-        </w:rPr>
         <w:t>一、目的</w:t>
       </w:r>
     </w:p>
     <w:p>
       <w:pPr>
-        <w:spacing w:before="40" w:after="40" w:line="360" w:lineRule="auto"/>
+        <w:spacing w:line="360" w:lineRule="auto" w:before="40" w:after="40"/>
         <w:ind w:firstLine="420"/>
       </w:pPr>
       <w:r>
@@ -54,25 +40,25 @@
           <w:b w:val="0"/>
           <w:sz w:val="24"/>
         </w:rPr>
-        <w:t>为强化公司经营重点工作及项目打单、执行过程中关键事项的闭环管理，弥补常规绩效考核对工资影响比例较低、侧重日常工作完成情况的不足，建立清单式、动态化的专项考核机制，压实责任、节点管控、结果兑现，特制定本制度。</w:t>
+        <w:t>专项考核是常规绩效考核的补充。常规绩效侧重日常工作、对工资影响比例低；专项考核针对公司经营及项目打单、执行中的重点工作，实行清单式管理，明确责任人和完成时间，按节点考核兑现。</w:t>
       </w:r>
     </w:p>
     <w:p>
       <w:pPr>
-        <w:spacing w:before="160" w:after="80"/>
+        <w:spacing w:before="200" w:after="80"/>
       </w:pPr>
       <w:r>
         <w:rPr>
           <w:rFonts w:ascii="黑体" w:hAnsi="黑体" w:eastAsia="黑体"/>
           <w:b/>
-          <w:sz w:val="24"/>
+          <w:sz w:val="28"/>
         </w:rPr>
         <w:t>二、适用范围</w:t>
       </w:r>
     </w:p>
     <w:p>
       <w:pPr>
-        <w:spacing w:before="40" w:after="40" w:line="360" w:lineRule="auto"/>
+        <w:spacing w:line="360" w:lineRule="auto" w:before="40" w:after="40"/>
         <w:ind w:firstLine="420"/>
       </w:pPr>
       <w:r>
@@ -81,25 +67,25 @@
           <w:b w:val="0"/>
           <w:sz w:val="24"/>
         </w:rPr>
-        <w:t>本制度适用于公司全体中层及以上管理人员，以及经总经理批准纳入专项考核清单的具体责任人；适用于公司经营工作、项目打单工作及项目执行工作中列入专项考核清单的重点事项。</w:t>
+        <w:t>适用于公司中层及以上管理人员，以及经总经理批准纳入清单的具体责任人。</w:t>
       </w:r>
     </w:p>
     <w:p>
       <w:pPr>
-        <w:spacing w:before="160" w:after="80"/>
+        <w:spacing w:before="200" w:after="80"/>
       </w:pPr>
       <w:r>
         <w:rPr>
           <w:rFonts w:ascii="黑体" w:hAnsi="黑体" w:eastAsia="黑体"/>
           <w:b/>
-          <w:sz w:val="24"/>
+          <w:sz w:val="28"/>
         </w:rPr>
-        <w:t>三、定义</w:t>
+        <w:t>三、考核事项</w:t>
       </w:r>
     </w:p>
     <w:p>
       <w:pPr>
-        <w:spacing w:before="40" w:after="40" w:line="360" w:lineRule="auto"/>
+        <w:spacing w:line="360" w:lineRule="auto" w:before="40" w:after="40"/>
         <w:ind w:firstLine="420"/>
       </w:pPr>
       <w:r>
@@ -108,67 +94,12 @@
           <w:b w:val="0"/>
           <w:sz w:val="24"/>
         </w:rPr>
-        <w:t>总经理专项考核，是指对公司经营工作以及项目打单及执行工作中的重点工作，实行单列清单式管理，明确事项内容、责任人和完成时间，并依据节点完成情况进行考核兑现的管理方式。专项考核是公司绩效考核体系的有效补充，与常规绩效考核并行实施、分别兑现。</w:t>
+        <w:t>由总经办统一归集，报总经理审批后纳入清单，主要包括：</w:t>
       </w:r>
     </w:p>
     <w:p>
       <w:pPr>
-        <w:spacing w:before="40" w:after="40" w:line="360" w:lineRule="auto"/>
-        <w:ind w:firstLine="420"/>
-      </w:pPr>
-      <w:r>
-        <w:rPr>
-          <w:rFonts w:ascii="宋体" w:hAnsi="宋体" w:eastAsia="宋体"/>
-          <w:b w:val="0"/>
-          <w:sz w:val="24"/>
-        </w:rPr>
-        <w:t>专项考核清单，是指由总经办统一归集、动态维护，经总经理审批后执行的重点工作事项台账，载明事项名称、事项来源、责任部门/责任人、完成节点、完成标准、推进状态及考核结果等内容。</w:t>
-      </w:r>
-    </w:p>
-    <w:p>
-      <w:pPr>
-        <w:spacing w:before="280" w:after="160"/>
-        <w:jc w:val="left"/>
-      </w:pPr>
-      <w:r>
-        <w:rPr>
-          <w:rFonts w:ascii="黑体" w:hAnsi="黑体" w:eastAsia="黑体"/>
-          <w:b/>
-          <w:sz w:val="28"/>
-        </w:rPr>
-        <w:t>第二部分  专项考核事项范围</w:t>
-      </w:r>
-    </w:p>
-    <w:p>
-      <w:pPr>
-        <w:spacing w:before="160" w:after="80"/>
-      </w:pPr>
-      <w:r>
-        <w:rPr>
-          <w:rFonts w:ascii="黑体" w:hAnsi="黑体" w:eastAsia="黑体"/>
-          <w:b/>
-          <w:sz w:val="24"/>
-        </w:rPr>
-        <w:t>一、可纳入专项考核的事项范围</w:t>
-      </w:r>
-    </w:p>
-    <w:p>
-      <w:pPr>
-        <w:spacing w:before="40" w:after="40" w:line="360" w:lineRule="auto"/>
-        <w:ind w:firstLine="420"/>
-      </w:pPr>
-      <w:r>
-        <w:rPr>
-          <w:rFonts w:ascii="宋体" w:hAnsi="宋体" w:eastAsia="宋体"/>
-          <w:b w:val="0"/>
-          <w:sz w:val="24"/>
-        </w:rPr>
-        <w:t>属于以下情形的，经核实后可纳入专项考核清单：</w:t>
-      </w:r>
-    </w:p>
-    <w:p>
-      <w:pPr>
-        <w:spacing w:before="20" w:after="20" w:line="360" w:lineRule="auto"/>
+        <w:spacing w:line="360" w:lineRule="auto" w:before="40" w:after="40"/>
         <w:ind w:firstLine="420"/>
       </w:pPr>
       <w:r>
@@ -182,7 +113,7 @@
     </w:p>
     <w:p>
       <w:pPr>
-        <w:spacing w:before="20" w:after="20" w:line="360" w:lineRule="auto"/>
+        <w:spacing w:line="360" w:lineRule="auto" w:before="40" w:after="40"/>
         <w:ind w:firstLine="420"/>
       </w:pPr>
       <w:r>
@@ -191,12 +122,12 @@
           <w:b w:val="0"/>
           <w:sz w:val="24"/>
         </w:rPr>
-        <w:t>（二）公司经营重大事项，包括但不限于重大经营决策落地、关键经营指标攻坚、重大客户/重大合同推进、重大风险处置等；</w:t>
+        <w:t>（二）公司经营重大事项；</w:t>
       </w:r>
     </w:p>
     <w:p>
       <w:pPr>
-        <w:spacing w:before="20" w:after="20" w:line="360" w:lineRule="auto"/>
+        <w:spacing w:line="360" w:lineRule="auto" w:before="40" w:after="40"/>
         <w:ind w:firstLine="420"/>
       </w:pPr>
       <w:r>
@@ -205,12 +136,12 @@
           <w:b w:val="0"/>
           <w:sz w:val="24"/>
         </w:rPr>
-        <w:t>（三）管理层例会及执行例会确定的重点工作事项；</w:t>
+        <w:t>（三）管理层例会及执行例会确定的重点工作事项。</w:t>
       </w:r>
     </w:p>
     <w:p>
       <w:pPr>
-        <w:spacing w:before="20" w:after="20" w:line="360" w:lineRule="auto"/>
+        <w:spacing w:line="360" w:lineRule="auto" w:before="40" w:after="40"/>
         <w:ind w:firstLine="420"/>
       </w:pPr>
       <w:r>
@@ -219,12 +150,25 @@
           <w:b w:val="0"/>
           <w:sz w:val="24"/>
         </w:rPr>
-        <w:t>（四）项目打单及项目执行过程中需跨部门协同、节点明确、对公司经营结果有重大影响的重点工作事项；</w:t>
+        <w:t>日常岗位工作、责任或节点不清的事项，不纳入专项考核。</w:t>
       </w:r>
     </w:p>
     <w:p>
       <w:pPr>
-        <w:spacing w:before="20" w:after="20" w:line="360" w:lineRule="auto"/>
+        <w:spacing w:before="200" w:after="80"/>
+      </w:pPr>
+      <w:r>
+        <w:rPr>
+          <w:rFonts w:ascii="黑体" w:hAnsi="黑体" w:eastAsia="黑体"/>
+          <w:b/>
+          <w:sz w:val="28"/>
+        </w:rPr>
+        <w:t>四、清单管理</w:t>
+      </w:r>
+    </w:p>
+    <w:p>
+      <w:pPr>
+        <w:spacing w:line="360" w:lineRule="auto" w:before="40" w:after="40"/>
         <w:ind w:firstLine="420"/>
       </w:pPr>
       <w:r>
@@ -233,25 +177,12 @@
           <w:b w:val="0"/>
           <w:sz w:val="24"/>
         </w:rPr>
-        <w:t>（五）其他经总经理审批同意纳入专项考核清单的事项。</w:t>
+        <w:t>（一）清单实行动态管理，由总经办统一维护，事项报总经理审批后执行；</w:t>
       </w:r>
     </w:p>
     <w:p>
       <w:pPr>
-        <w:spacing w:before="160" w:after="80"/>
-      </w:pPr>
-      <w:r>
-        <w:rPr>
-          <w:rFonts w:ascii="黑体" w:hAnsi="黑体" w:eastAsia="黑体"/>
-          <w:b/>
-          <w:sz w:val="24"/>
-        </w:rPr>
-        <w:t>二、不纳入专项考核的事项范围</w:t>
-      </w:r>
-    </w:p>
-    <w:p>
-      <w:pPr>
-        <w:spacing w:before="40" w:after="40" w:line="360" w:lineRule="auto"/>
+        <w:spacing w:line="360" w:lineRule="auto" w:before="40" w:after="40"/>
         <w:ind w:firstLine="420"/>
       </w:pPr>
       <w:r>
@@ -260,12 +191,12 @@
           <w:b w:val="0"/>
           <w:sz w:val="24"/>
         </w:rPr>
-        <w:t>属于以下情形，原则上不纳入专项考核清单：</w:t>
+        <w:t>（二）每项须明确：事项名称、责任人、完成时间、完成标准；</w:t>
       </w:r>
     </w:p>
     <w:p>
       <w:pPr>
-        <w:spacing w:before="20" w:after="20" w:line="360" w:lineRule="auto"/>
+        <w:spacing w:line="360" w:lineRule="auto" w:before="40" w:after="40"/>
         <w:ind w:firstLine="420"/>
       </w:pPr>
       <w:r>
@@ -274,12 +205,25 @@
           <w:b w:val="0"/>
           <w:sz w:val="24"/>
         </w:rPr>
-        <w:t>（一）属于常规绩效考核覆盖的日常岗位工作事项；</w:t>
+        <w:t>（三）事项完成经确认后销项，内容、责任人或完成时间变更须经审批后更新。</w:t>
       </w:r>
     </w:p>
     <w:p>
       <w:pPr>
-        <w:spacing w:before="20" w:after="20" w:line="360" w:lineRule="auto"/>
+        <w:spacing w:before="200" w:after="80"/>
+      </w:pPr>
+      <w:r>
+        <w:rPr>
+          <w:rFonts w:ascii="黑体" w:hAnsi="黑体" w:eastAsia="黑体"/>
+          <w:b/>
+          <w:sz w:val="28"/>
+        </w:rPr>
+        <w:t>五、考核与兑现</w:t>
+      </w:r>
+    </w:p>
+    <w:p>
+      <w:pPr>
+        <w:spacing w:line="360" w:lineRule="auto" w:before="40" w:after="40"/>
         <w:ind w:firstLine="420"/>
       </w:pPr>
       <w:r>
@@ -288,12 +232,12 @@
           <w:b w:val="0"/>
           <w:sz w:val="24"/>
         </w:rPr>
-        <w:t>（二）事项边界不清、责任主体无法明确、完成标准无法量化或无法验收的事项；</w:t>
+        <w:t>（一）未完成：事项未按节点完成的，对责任人按300元/个考核，次月工资兑现；</w:t>
       </w:r>
     </w:p>
     <w:p>
       <w:pPr>
-        <w:spacing w:before="20" w:after="20" w:line="360" w:lineRule="auto"/>
+        <w:spacing w:line="360" w:lineRule="auto" w:before="40" w:after="40"/>
         <w:ind w:firstLine="420"/>
       </w:pPr>
       <w:r>
@@ -302,12 +246,12 @@
           <w:b w:val="0"/>
           <w:sz w:val="24"/>
         </w:rPr>
-        <w:t>（三）未明确完成时间节点，或完成节点明显不具备可执行性的事项；</w:t>
+        <w:t>（二）辅导重配：未完成事项由总经办辅导，重新匹配完成时间；</w:t>
       </w:r>
     </w:p>
     <w:p>
       <w:pPr>
-        <w:spacing w:before="20" w:after="20" w:line="360" w:lineRule="auto"/>
+        <w:spacing w:line="360" w:lineRule="auto" w:before="40" w:after="40"/>
         <w:ind w:firstLine="420"/>
       </w:pPr>
       <w:r>
@@ -316,26 +260,12 @@
           <w:b w:val="0"/>
           <w:sz w:val="24"/>
         </w:rPr>
-        <w:t>（四）未经总经理审批，擅自列入清单的事项。</w:t>
+        <w:t>（三）降薪：重新匹配时间后仍未完成的，对责任人进行降薪处理，幅度由总经办提出、报总经理审批；</w:t>
       </w:r>
     </w:p>
     <w:p>
       <w:pPr>
-        <w:spacing w:before="280" w:after="160"/>
-        <w:jc w:val="left"/>
-      </w:pPr>
-      <w:r>
-        <w:rPr>
-          <w:rFonts w:ascii="黑体" w:hAnsi="黑体" w:eastAsia="黑体"/>
-          <w:b/>
-          <w:sz w:val="28"/>
-        </w:rPr>
-        <w:t>第三部分  专项考核管理各部门职责</w:t>
-      </w:r>
-    </w:p>
-    <w:p>
-      <w:pPr>
-        <w:spacing w:before="40" w:after="40" w:line="360" w:lineRule="auto"/>
+        <w:spacing w:line="360" w:lineRule="auto" w:before="40" w:after="40"/>
         <w:ind w:firstLine="420"/>
       </w:pPr>
       <w:r>
@@ -344,25 +274,25 @@
           <w:b w:val="0"/>
           <w:sz w:val="24"/>
         </w:rPr>
-        <w:t>专项考核管理的第一责任部门为总经办，对专项考核事项的归集、动态维护、督办辅导、考核提报及档案管理负统一管理责任。各部门在此基础上按职责分工履行执行与支持职能。</w:t>
+        <w:t>（四）申诉：如遇不可抗力或非主观原因，可一事一议向总经理申诉，批准后执行。</w:t>
       </w:r>
     </w:p>
     <w:p>
       <w:pPr>
-        <w:spacing w:before="160" w:after="80"/>
+        <w:spacing w:before="200" w:after="80"/>
       </w:pPr>
       <w:r>
         <w:rPr>
           <w:rFonts w:ascii="黑体" w:hAnsi="黑体" w:eastAsia="黑体"/>
           <w:b/>
-          <w:sz w:val="24"/>
+          <w:sz w:val="28"/>
         </w:rPr>
-        <w:t>第一条 总经办</w:t>
+        <w:t>六、附则</w:t>
       </w:r>
     </w:p>
     <w:p>
       <w:pPr>
-        <w:spacing w:before="20" w:after="20" w:line="360" w:lineRule="auto"/>
+        <w:spacing w:line="360" w:lineRule="auto" w:before="40" w:after="40"/>
         <w:ind w:firstLine="420"/>
       </w:pPr>
       <w:r>
@@ -371,12 +301,12 @@
           <w:b w:val="0"/>
           <w:sz w:val="24"/>
         </w:rPr>
-        <w:t>（一）负责本制度的组织实施与统一管理；</w:t>
+        <w:t>（一）本制度由总经办统一管理并负责解释；专项考核结果与常规绩效分别兑现。</w:t>
       </w:r>
     </w:p>
     <w:p>
       <w:pPr>
-        <w:spacing w:before="20" w:after="20" w:line="360" w:lineRule="auto"/>
+        <w:spacing w:line="360" w:lineRule="auto" w:before="40" w:after="40"/>
         <w:ind w:firstLine="420"/>
       </w:pPr>
       <w:r>
@@ -385,753 +315,12 @@
           <w:b w:val="0"/>
           <w:sz w:val="24"/>
         </w:rPr>
-        <w:t>（二）负责专项考核事项的收集、梳理、建账，形成专项考核清单，报总经理审批后执行；</w:t>
+        <w:t>（二）本制度自发布之日起施行。</w:t>
       </w:r>
     </w:p>
     <w:p>
       <w:pPr>
-        <w:spacing w:before="20" w:after="20" w:line="360" w:lineRule="auto"/>
-        <w:ind w:firstLine="420"/>
-      </w:pPr>
-      <w:r>
-        <w:rPr>
-          <w:rFonts w:ascii="宋体" w:hAnsi="宋体" w:eastAsia="宋体"/>
-          <w:b w:val="0"/>
-          <w:sz w:val="24"/>
-        </w:rPr>
-        <w:t>（三）负责清单动态更新，跟踪事项推进状态，组织节点核查与完成情况确认；</w:t>
-      </w:r>
-    </w:p>
-    <w:p>
-      <w:pPr>
-        <w:spacing w:before="20" w:after="20" w:line="360" w:lineRule="auto"/>
-        <w:ind w:firstLine="420"/>
-      </w:pPr>
-      <w:r>
-        <w:rPr>
-          <w:rFonts w:ascii="宋体" w:hAnsi="宋体" w:eastAsia="宋体"/>
-          <w:b w:val="0"/>
-          <w:sz w:val="24"/>
-        </w:rPr>
-        <w:t>（四）对未按节点完成的事项，组织辅导，协助责任人分析原因并重新匹配完成时间；</w:t>
-      </w:r>
-    </w:p>
-    <w:p>
-      <w:pPr>
-        <w:spacing w:before="20" w:after="20" w:line="360" w:lineRule="auto"/>
-        <w:ind w:firstLine="420"/>
-      </w:pPr>
-      <w:r>
-        <w:rPr>
-          <w:rFonts w:ascii="宋体" w:hAnsi="宋体" w:eastAsia="宋体"/>
-          <w:b w:val="0"/>
-          <w:sz w:val="24"/>
-        </w:rPr>
-        <w:t>（五）按月汇总未完成事项及考核意见，报总经理审批后，移交相关部门兑现；</w:t>
-      </w:r>
-    </w:p>
-    <w:p>
-      <w:pPr>
-        <w:spacing w:before="20" w:after="20" w:line="360" w:lineRule="auto"/>
-        <w:ind w:firstLine="420"/>
-      </w:pPr>
-      <w:r>
-        <w:rPr>
-          <w:rFonts w:ascii="宋体" w:hAnsi="宋体" w:eastAsia="宋体"/>
-          <w:b w:val="0"/>
-          <w:sz w:val="24"/>
-        </w:rPr>
-        <w:t>（六）负责专项考核相关资料的归档与统计分析，定期向总经理及管理层报告。</w:t>
-      </w:r>
-    </w:p>
-    <w:p>
-      <w:pPr>
-        <w:spacing w:before="160" w:after="80"/>
-      </w:pPr>
-      <w:r>
-        <w:rPr>
-          <w:rFonts w:ascii="黑体" w:hAnsi="黑体" w:eastAsia="黑体"/>
-          <w:b/>
-          <w:sz w:val="24"/>
-        </w:rPr>
-        <w:t>第二条 事项责任部门/责任人</w:t>
-      </w:r>
-    </w:p>
-    <w:p>
-      <w:pPr>
-        <w:spacing w:before="20" w:after="20" w:line="360" w:lineRule="auto"/>
-        <w:ind w:firstLine="420"/>
-      </w:pPr>
-      <w:r>
-        <w:rPr>
-          <w:rFonts w:ascii="宋体" w:hAnsi="宋体" w:eastAsia="宋体"/>
-          <w:b w:val="0"/>
-          <w:sz w:val="24"/>
-        </w:rPr>
-        <w:t>（一）对纳入清单的事项负直接完成责任，应按明确节点推进并达成完成标准；</w:t>
-      </w:r>
-    </w:p>
-    <w:p>
-      <w:pPr>
-        <w:spacing w:before="20" w:after="20" w:line="360" w:lineRule="auto"/>
-        <w:ind w:firstLine="420"/>
-      </w:pPr>
-      <w:r>
-        <w:rPr>
-          <w:rFonts w:ascii="宋体" w:hAnsi="宋体" w:eastAsia="宋体"/>
-          <w:b w:val="0"/>
-          <w:sz w:val="24"/>
-        </w:rPr>
-        <w:t>（二）及时向总经办反馈推进进展、风险及需协调事项，不得隐瞒延误；</w:t>
-      </w:r>
-    </w:p>
-    <w:p>
-      <w:pPr>
-        <w:spacing w:before="20" w:after="20" w:line="360" w:lineRule="auto"/>
-        <w:ind w:firstLine="420"/>
-      </w:pPr>
-      <w:r>
-        <w:rPr>
-          <w:rFonts w:ascii="宋体" w:hAnsi="宋体" w:eastAsia="宋体"/>
-          <w:b w:val="0"/>
-          <w:sz w:val="24"/>
-        </w:rPr>
-        <w:t>（三）事项因客观原因无法按原节点完成的，应在节点到期前主动说明情况，配合总经办办理重新匹配时间或申诉事宜；</w:t>
-      </w:r>
-    </w:p>
-    <w:p>
-      <w:pPr>
-        <w:spacing w:before="20" w:after="20" w:line="360" w:lineRule="auto"/>
-        <w:ind w:firstLine="420"/>
-      </w:pPr>
-      <w:r>
-        <w:rPr>
-          <w:rFonts w:ascii="宋体" w:hAnsi="宋体" w:eastAsia="宋体"/>
-          <w:b w:val="0"/>
-          <w:sz w:val="24"/>
-        </w:rPr>
-        <w:t>（四）对重新匹配时间后的事项，仍应严格按新节点完成。</w:t>
-      </w:r>
-    </w:p>
-    <w:p>
-      <w:pPr>
-        <w:spacing w:before="160" w:after="80"/>
-      </w:pPr>
-      <w:r>
-        <w:rPr>
-          <w:rFonts w:ascii="黑体" w:hAnsi="黑体" w:eastAsia="黑体"/>
-          <w:b/>
-          <w:sz w:val="24"/>
-        </w:rPr>
-        <w:t>第三条 各职能部门负责人</w:t>
-      </w:r>
-    </w:p>
-    <w:p>
-      <w:pPr>
-        <w:spacing w:before="20" w:after="20" w:line="360" w:lineRule="auto"/>
-        <w:ind w:firstLine="420"/>
-      </w:pPr>
-      <w:r>
-        <w:rPr>
-          <w:rFonts w:ascii="宋体" w:hAnsi="宋体" w:eastAsia="宋体"/>
-          <w:b w:val="0"/>
-          <w:sz w:val="24"/>
-        </w:rPr>
-        <w:t>（一）对本部门列入专项考核清单的事项负管理责任，督促责任人按期完成；</w:t>
-      </w:r>
-    </w:p>
-    <w:p>
-      <w:pPr>
-        <w:spacing w:before="20" w:after="20" w:line="360" w:lineRule="auto"/>
-        <w:ind w:firstLine="420"/>
-      </w:pPr>
-      <w:r>
-        <w:rPr>
-          <w:rFonts w:ascii="宋体" w:hAnsi="宋体" w:eastAsia="宋体"/>
-          <w:b w:val="0"/>
-          <w:sz w:val="24"/>
-        </w:rPr>
-        <w:t>（二）配合总经办开展事项核实、辅导及跨部门协调；</w:t>
-      </w:r>
-    </w:p>
-    <w:p>
-      <w:pPr>
-        <w:spacing w:before="20" w:after="20" w:line="360" w:lineRule="auto"/>
-        <w:ind w:firstLine="420"/>
-      </w:pPr>
-      <w:r>
-        <w:rPr>
-          <w:rFonts w:ascii="宋体" w:hAnsi="宋体" w:eastAsia="宋体"/>
-          <w:b w:val="0"/>
-          <w:sz w:val="24"/>
-        </w:rPr>
-        <w:t>（三）在管理层例会、执行例会中提出拟纳入专项考核的重点事项建议。</w:t>
-      </w:r>
-    </w:p>
-    <w:p>
-      <w:pPr>
-        <w:spacing w:before="160" w:after="80"/>
-      </w:pPr>
-      <w:r>
-        <w:rPr>
-          <w:rFonts w:ascii="黑体" w:hAnsi="黑体" w:eastAsia="黑体"/>
-          <w:b/>
-          <w:sz w:val="24"/>
-        </w:rPr>
-        <w:t>第四条 人力资源部/财务部</w:t>
-      </w:r>
-    </w:p>
-    <w:p>
-      <w:pPr>
-        <w:spacing w:before="20" w:after="20" w:line="360" w:lineRule="auto"/>
-        <w:ind w:firstLine="420"/>
-      </w:pPr>
-      <w:r>
-        <w:rPr>
-          <w:rFonts w:ascii="宋体" w:hAnsi="宋体" w:eastAsia="宋体"/>
-          <w:b w:val="0"/>
-          <w:sz w:val="24"/>
-        </w:rPr>
-        <w:t>（一）人力资源部负责依据经总经理审批的专项考核结果，办理考核金额在次月工资中的兑现，以及降薪等人事处理手续；</w:t>
-      </w:r>
-    </w:p>
-    <w:p>
-      <w:pPr>
-        <w:spacing w:before="20" w:after="20" w:line="360" w:lineRule="auto"/>
-        <w:ind w:firstLine="420"/>
-      </w:pPr>
-      <w:r>
-        <w:rPr>
-          <w:rFonts w:ascii="宋体" w:hAnsi="宋体" w:eastAsia="宋体"/>
-          <w:b w:val="0"/>
-          <w:sz w:val="24"/>
-        </w:rPr>
-        <w:t>（二）财务部负责配合完成相关薪酬扣减的核算与发放支持；</w:t>
-      </w:r>
-    </w:p>
-    <w:p>
-      <w:pPr>
-        <w:spacing w:before="20" w:after="20" w:line="360" w:lineRule="auto"/>
-        <w:ind w:firstLine="420"/>
-      </w:pPr>
-      <w:r>
-        <w:rPr>
-          <w:rFonts w:ascii="宋体" w:hAnsi="宋体" w:eastAsia="宋体"/>
-          <w:b w:val="0"/>
-          <w:sz w:val="24"/>
-        </w:rPr>
-        <w:t>（三）对考核兑现过程中涉及的数据核对提供专业支持。</w:t>
-      </w:r>
-    </w:p>
-    <w:p>
-      <w:pPr>
-        <w:spacing w:before="280" w:after="160"/>
-        <w:jc w:val="left"/>
-      </w:pPr>
-      <w:r>
-        <w:rPr>
-          <w:rFonts w:ascii="黑体" w:hAnsi="黑体" w:eastAsia="黑体"/>
-          <w:b/>
-          <w:sz w:val="28"/>
-        </w:rPr>
-        <w:t>第四部分  专项考核清单管理要求</w:t>
-      </w:r>
-    </w:p>
-    <w:p>
-      <w:pPr>
-        <w:spacing w:before="160" w:after="80"/>
-      </w:pPr>
-      <w:r>
-        <w:rPr>
-          <w:rFonts w:ascii="黑体" w:hAnsi="黑体" w:eastAsia="黑体"/>
-          <w:b/>
-          <w:sz w:val="24"/>
-        </w:rPr>
-        <w:t>第一条 清单式管理原则</w:t>
-      </w:r>
-    </w:p>
-    <w:p>
-      <w:pPr>
-        <w:spacing w:before="40" w:after="40" w:line="360" w:lineRule="auto"/>
-        <w:ind w:firstLine="420"/>
-      </w:pPr>
-      <w:r>
-        <w:rPr>
-          <w:rFonts w:ascii="宋体" w:hAnsi="宋体" w:eastAsia="宋体"/>
-          <w:b w:val="0"/>
-          <w:sz w:val="24"/>
-        </w:rPr>
-        <w:t>专项考核事项实行单列清单式管理。每项事项须明确：事项名称、事项来源、责任部门、责任人、完成时间、完成标准、当前状态。不得将责任不清、节点不清的事项笼统列入清单。</w:t>
-      </w:r>
-    </w:p>
-    <w:p>
-      <w:pPr>
-        <w:spacing w:before="160" w:after="80"/>
-      </w:pPr>
-      <w:r>
-        <w:rPr>
-          <w:rFonts w:ascii="黑体" w:hAnsi="黑体" w:eastAsia="黑体"/>
-          <w:b/>
-          <w:sz w:val="24"/>
-        </w:rPr>
-        <w:t>第二条 动态管理原则</w:t>
-      </w:r>
-    </w:p>
-    <w:p>
-      <w:pPr>
-        <w:spacing w:before="20" w:after="20" w:line="360" w:lineRule="auto"/>
-        <w:ind w:firstLine="420"/>
-      </w:pPr>
-      <w:r>
-        <w:rPr>
-          <w:rFonts w:ascii="宋体" w:hAnsi="宋体" w:eastAsia="宋体"/>
-          <w:b w:val="0"/>
-          <w:sz w:val="24"/>
-        </w:rPr>
-        <w:t>（一）专项考核清单由总经办实行动态管理，可根据经营需要、会议决议及总经理交办情况增补、调整或销项；</w:t>
-      </w:r>
-    </w:p>
-    <w:p>
-      <w:pPr>
-        <w:spacing w:before="20" w:after="20" w:line="360" w:lineRule="auto"/>
-        <w:ind w:firstLine="420"/>
-      </w:pPr>
-      <w:r>
-        <w:rPr>
-          <w:rFonts w:ascii="宋体" w:hAnsi="宋体" w:eastAsia="宋体"/>
-          <w:b w:val="0"/>
-          <w:sz w:val="24"/>
-        </w:rPr>
-        <w:t>（二）事项完成后，经总经办核实确认，报总经理同意后予以销项关闭；</w:t>
-      </w:r>
-    </w:p>
-    <w:p>
-      <w:pPr>
-        <w:spacing w:before="20" w:after="20" w:line="360" w:lineRule="auto"/>
-        <w:ind w:firstLine="420"/>
-      </w:pPr>
-      <w:r>
-        <w:rPr>
-          <w:rFonts w:ascii="宋体" w:hAnsi="宋体" w:eastAsia="宋体"/>
-          <w:b w:val="0"/>
-          <w:sz w:val="24"/>
-        </w:rPr>
-        <w:t>（三）事项内容、责任人或完成时间发生变更的，须履行审批程序后更新清单，不得擅自变更。</w:t>
-      </w:r>
-    </w:p>
-    <w:p>
-      <w:pPr>
-        <w:spacing w:before="160" w:after="80"/>
-      </w:pPr>
-      <w:r>
-        <w:rPr>
-          <w:rFonts w:ascii="黑体" w:hAnsi="黑体" w:eastAsia="黑体"/>
-          <w:b/>
-          <w:sz w:val="24"/>
-        </w:rPr>
-        <w:t>第三条 立项与审批</w:t>
-      </w:r>
-    </w:p>
-    <w:p>
-      <w:pPr>
-        <w:spacing w:before="20" w:after="20" w:line="360" w:lineRule="auto"/>
-        <w:ind w:firstLine="420"/>
-      </w:pPr>
-      <w:r>
-        <w:rPr>
-          <w:rFonts w:ascii="宋体" w:hAnsi="宋体" w:eastAsia="宋体"/>
-          <w:b w:val="0"/>
-          <w:sz w:val="24"/>
-        </w:rPr>
-        <w:t>（一）专项考核事项来源包括：总经理交办、经营重大事项提报、管理层例会及执行例会重点工作提炼等；</w:t>
-      </w:r>
-    </w:p>
-    <w:p>
-      <w:pPr>
-        <w:spacing w:before="20" w:after="20" w:line="360" w:lineRule="auto"/>
-        <w:ind w:firstLine="420"/>
-      </w:pPr>
-      <w:r>
-        <w:rPr>
-          <w:rFonts w:ascii="宋体" w:hAnsi="宋体" w:eastAsia="宋体"/>
-          <w:b w:val="0"/>
-          <w:sz w:val="24"/>
-        </w:rPr>
-        <w:t>（二）总经办汇总拟纳入事项后，形成专项考核清单（或增补清单），报总经理审批；</w:t>
-      </w:r>
-    </w:p>
-    <w:p>
-      <w:pPr>
-        <w:spacing w:before="20" w:after="20" w:line="360" w:lineRule="auto"/>
-        <w:ind w:firstLine="420"/>
-      </w:pPr>
-      <w:r>
-        <w:rPr>
-          <w:rFonts w:ascii="宋体" w:hAnsi="宋体" w:eastAsia="宋体"/>
-          <w:b w:val="0"/>
-          <w:sz w:val="24"/>
-        </w:rPr>
-        <w:t>（三）未经总经理审批的事项，不得作为专项考核依据执行。</w:t>
-      </w:r>
-    </w:p>
-    <w:p>
-      <w:pPr>
-        <w:spacing w:before="160" w:after="80"/>
-      </w:pPr>
-      <w:r>
-        <w:rPr>
-          <w:rFonts w:ascii="黑体" w:hAnsi="黑体" w:eastAsia="黑体"/>
-          <w:b/>
-          <w:sz w:val="24"/>
-        </w:rPr>
-        <w:t>第四条 过程跟踪与节点管理</w:t>
-      </w:r>
-    </w:p>
-    <w:p>
-      <w:pPr>
-        <w:spacing w:before="20" w:after="20" w:line="360" w:lineRule="auto"/>
-        <w:ind w:firstLine="420"/>
-      </w:pPr>
-      <w:r>
-        <w:rPr>
-          <w:rFonts w:ascii="宋体" w:hAnsi="宋体" w:eastAsia="宋体"/>
-          <w:b w:val="0"/>
-          <w:sz w:val="24"/>
-        </w:rPr>
-        <w:t>（一）责任人应按节点推进事项，总经办按清单进行督办跟踪；</w:t>
-      </w:r>
-    </w:p>
-    <w:p>
-      <w:pPr>
-        <w:spacing w:before="20" w:after="20" w:line="360" w:lineRule="auto"/>
-        <w:ind w:firstLine="420"/>
-      </w:pPr>
-      <w:r>
-        <w:rPr>
-          <w:rFonts w:ascii="宋体" w:hAnsi="宋体" w:eastAsia="宋体"/>
-          <w:b w:val="0"/>
-          <w:sz w:val="24"/>
-        </w:rPr>
-        <w:t>（二）事项未按照节点完成的，纳入当月未完成事项统计；</w:t>
-      </w:r>
-    </w:p>
-    <w:p>
-      <w:pPr>
-        <w:spacing w:before="20" w:after="20" w:line="360" w:lineRule="auto"/>
-        <w:ind w:firstLine="420"/>
-      </w:pPr>
-      <w:r>
-        <w:rPr>
-          <w:rFonts w:ascii="宋体" w:hAnsi="宋体" w:eastAsia="宋体"/>
-          <w:b w:val="0"/>
-          <w:sz w:val="24"/>
-        </w:rPr>
-        <w:t>（三）对未完成事项，由总经办进行辅导，组织责任人分析原因，重新匹配完成时间，并更新清单；</w:t>
-      </w:r>
-    </w:p>
-    <w:p>
-      <w:pPr>
-        <w:spacing w:before="20" w:after="20" w:line="360" w:lineRule="auto"/>
-        <w:ind w:firstLine="420"/>
-      </w:pPr>
-      <w:r>
-        <w:rPr>
-          <w:rFonts w:ascii="宋体" w:hAnsi="宋体" w:eastAsia="宋体"/>
-          <w:b w:val="0"/>
-          <w:sz w:val="24"/>
-        </w:rPr>
-        <w:t>（四）重新匹配时间后仍未完成的，按本制度第五部分规定进行降薪处理。</w:t>
-      </w:r>
-    </w:p>
-    <w:p>
-      <w:pPr>
-        <w:spacing w:before="280" w:after="160"/>
-        <w:jc w:val="left"/>
-      </w:pPr>
-      <w:r>
-        <w:rPr>
-          <w:rFonts w:ascii="黑体" w:hAnsi="黑体" w:eastAsia="黑体"/>
-          <w:b/>
-          <w:sz w:val="28"/>
-        </w:rPr>
-        <w:t>第五部分  考核标准与兑现</w:t>
-      </w:r>
-    </w:p>
-    <w:p>
-      <w:pPr>
-        <w:spacing w:before="160" w:after="80"/>
-      </w:pPr>
-      <w:r>
-        <w:rPr>
-          <w:rFonts w:ascii="黑体" w:hAnsi="黑体" w:eastAsia="黑体"/>
-          <w:b/>
-          <w:sz w:val="24"/>
-        </w:rPr>
-        <w:t>第一条 未完成事项考核</w:t>
-      </w:r>
-    </w:p>
-    <w:p>
-      <w:pPr>
-        <w:spacing w:before="40" w:after="40" w:line="360" w:lineRule="auto"/>
-        <w:ind w:firstLine="420"/>
-      </w:pPr>
-      <w:r>
-        <w:rPr>
-          <w:rFonts w:ascii="宋体" w:hAnsi="宋体" w:eastAsia="宋体"/>
-          <w:b w:val="0"/>
-          <w:sz w:val="24"/>
-        </w:rPr>
-        <w:t>事项未按照节点完成的，对事项责任人按300元/个进行考核，考核结果于次月工资兑现。</w:t>
-      </w:r>
-    </w:p>
-    <w:p>
-      <w:pPr>
-        <w:spacing w:before="160" w:after="80"/>
-      </w:pPr>
-      <w:r>
-        <w:rPr>
-          <w:rFonts w:ascii="黑体" w:hAnsi="黑体" w:eastAsia="黑体"/>
-          <w:b/>
-          <w:sz w:val="24"/>
-        </w:rPr>
-        <w:t>第二条 重新匹配时间后仍未完成的处理</w:t>
-      </w:r>
-    </w:p>
-    <w:p>
-      <w:pPr>
-        <w:spacing w:before="40" w:after="40" w:line="360" w:lineRule="auto"/>
-        <w:ind w:firstLine="420"/>
-      </w:pPr>
-      <w:r>
-        <w:rPr>
-          <w:rFonts w:ascii="宋体" w:hAnsi="宋体" w:eastAsia="宋体"/>
-          <w:b w:val="0"/>
-          <w:sz w:val="24"/>
-        </w:rPr>
-        <w:t>对未完成事项，由总经办辅导后重新匹配完成时间；如重新匹配时间后仍未完成的，对责任人进行降薪处理。降薪幅度及执行方式由总经办提出建议，报总经理审批后执行。</w:t>
-      </w:r>
-    </w:p>
-    <w:p>
-      <w:pPr>
-        <w:spacing w:before="160" w:after="80"/>
-      </w:pPr>
-      <w:r>
-        <w:rPr>
-          <w:rFonts w:ascii="黑体" w:hAnsi="黑体" w:eastAsia="黑体"/>
-          <w:b/>
-          <w:sz w:val="24"/>
-        </w:rPr>
-        <w:t>第三条 不可抗力及非主观原因申诉</w:t>
-      </w:r>
-    </w:p>
-    <w:p>
-      <w:pPr>
-        <w:spacing w:before="40" w:after="40" w:line="360" w:lineRule="auto"/>
-        <w:ind w:firstLine="420"/>
-      </w:pPr>
-      <w:r>
-        <w:rPr>
-          <w:rFonts w:ascii="宋体" w:hAnsi="宋体" w:eastAsia="宋体"/>
-          <w:b w:val="0"/>
-          <w:sz w:val="24"/>
-        </w:rPr>
-        <w:t>过程中如遇不可抗力或非主观原因导致事项未能按节点完成的，可一事一议提出申诉，经总经理批准后，可减免考核、调整节点或不予降薪。申诉应由责任人书面说明原因及证明材料，经总经办核实后报总经理审批执行。</w:t>
-      </w:r>
-    </w:p>
-    <w:p>
-      <w:pPr>
-        <w:spacing w:before="160" w:after="80"/>
-      </w:pPr>
-      <w:r>
-        <w:rPr>
-          <w:rFonts w:ascii="黑体" w:hAnsi="黑体" w:eastAsia="黑体"/>
-          <w:b/>
-          <w:sz w:val="24"/>
-        </w:rPr>
-        <w:t>第四条 考核结果运用</w:t>
-      </w:r>
-    </w:p>
-    <w:p>
-      <w:pPr>
-        <w:spacing w:before="20" w:after="20" w:line="360" w:lineRule="auto"/>
-        <w:ind w:firstLine="420"/>
-      </w:pPr>
-      <w:r>
-        <w:rPr>
-          <w:rFonts w:ascii="宋体" w:hAnsi="宋体" w:eastAsia="宋体"/>
-          <w:b w:val="0"/>
-          <w:sz w:val="24"/>
-        </w:rPr>
-        <w:t>（一）专项考核结果与常规绩效考核分别核算、分别兑现，互不影响既有绩效考核规则；</w:t>
-      </w:r>
-    </w:p>
-    <w:p>
-      <w:pPr>
-        <w:spacing w:before="20" w:after="20" w:line="360" w:lineRule="auto"/>
-        <w:ind w:firstLine="420"/>
-      </w:pPr>
-      <w:r>
-        <w:rPr>
-          <w:rFonts w:ascii="宋体" w:hAnsi="宋体" w:eastAsia="宋体"/>
-          <w:b w:val="0"/>
-          <w:sz w:val="24"/>
-        </w:rPr>
-        <w:t>（二）专项考核情况可作为干部履职评价、岗位调整及评优评先的重要参考；</w:t>
-      </w:r>
-    </w:p>
-    <w:p>
-      <w:pPr>
-        <w:spacing w:before="20" w:after="20" w:line="360" w:lineRule="auto"/>
-        <w:ind w:firstLine="420"/>
-      </w:pPr>
-      <w:r>
-        <w:rPr>
-          <w:rFonts w:ascii="宋体" w:hAnsi="宋体" w:eastAsia="宋体"/>
-          <w:b w:val="0"/>
-          <w:sz w:val="24"/>
-        </w:rPr>
-        <w:t>（三）连续多次未完成或造成重大经营影响的，除按本制度考核外，可另行提请总经理从重处理。</w:t>
-      </w:r>
-    </w:p>
-    <w:p>
-      <w:pPr>
-        <w:spacing w:before="280" w:after="160"/>
-        <w:jc w:val="left"/>
-      </w:pPr>
-      <w:r>
-        <w:rPr>
-          <w:rFonts w:ascii="黑体" w:hAnsi="黑体" w:eastAsia="黑体"/>
-          <w:b/>
-          <w:sz w:val="28"/>
-        </w:rPr>
-        <w:t>第六部分  档案管理</w:t>
-      </w:r>
-    </w:p>
-    <w:p>
-      <w:pPr>
-        <w:spacing w:before="160" w:after="80"/>
-      </w:pPr>
-      <w:r>
-        <w:rPr>
-          <w:rFonts w:ascii="黑体" w:hAnsi="黑体" w:eastAsia="黑体"/>
-          <w:b/>
-          <w:sz w:val="24"/>
-        </w:rPr>
-        <w:t>第一条</w:t>
-      </w:r>
-    </w:p>
-    <w:p>
-      <w:pPr>
-        <w:spacing w:before="40" w:after="40" w:line="360" w:lineRule="auto"/>
-        <w:ind w:firstLine="420"/>
-      </w:pPr>
-      <w:r>
-        <w:rPr>
-          <w:rFonts w:ascii="宋体" w:hAnsi="宋体" w:eastAsia="宋体"/>
-          <w:b w:val="0"/>
-          <w:sz w:val="24"/>
-        </w:rPr>
-        <w:t>专项考核档案由总经办统一建档管理，需包含：专项考核清单及历次更新记录、事项完成证明或验收记录、未完成事项统计表、辅导及重新匹配时间记录、考核兑现审批单、申诉及审批材料等。</w:t>
-      </w:r>
-    </w:p>
-    <w:p>
-      <w:pPr>
-        <w:spacing w:before="160" w:after="80"/>
-      </w:pPr>
-      <w:r>
-        <w:rPr>
-          <w:rFonts w:ascii="黑体" w:hAnsi="黑体" w:eastAsia="黑体"/>
-          <w:b/>
-          <w:sz w:val="24"/>
-        </w:rPr>
-        <w:t>第二条</w:t>
-      </w:r>
-    </w:p>
-    <w:p>
-      <w:pPr>
-        <w:spacing w:before="40" w:after="40" w:line="360" w:lineRule="auto"/>
-        <w:ind w:firstLine="420"/>
-      </w:pPr>
-      <w:r>
-        <w:rPr>
-          <w:rFonts w:ascii="宋体" w:hAnsi="宋体" w:eastAsia="宋体"/>
-          <w:b w:val="0"/>
-          <w:sz w:val="24"/>
-        </w:rPr>
-        <w:t>专项考核清单实行统一编号管理，事项增补、变更、销项均应留痕，确保可追溯。</w:t>
-      </w:r>
-    </w:p>
-    <w:p>
-      <w:pPr>
-        <w:spacing w:before="280" w:after="160"/>
-        <w:jc w:val="left"/>
-      </w:pPr>
-      <w:r>
-        <w:rPr>
-          <w:rFonts w:ascii="黑体" w:hAnsi="黑体" w:eastAsia="黑体"/>
-          <w:b/>
-          <w:sz w:val="28"/>
-        </w:rPr>
-        <w:t>第七部分  附则</w:t>
-      </w:r>
-    </w:p>
-    <w:p>
-      <w:pPr>
-        <w:spacing w:before="160" w:after="80"/>
-      </w:pPr>
-      <w:r>
-        <w:rPr>
-          <w:rFonts w:ascii="黑体" w:hAnsi="黑体" w:eastAsia="黑体"/>
-          <w:b/>
-          <w:sz w:val="24"/>
-        </w:rPr>
-        <w:t>第一条</w:t>
-      </w:r>
-    </w:p>
-    <w:p>
-      <w:pPr>
-        <w:spacing w:before="40" w:after="40" w:line="360" w:lineRule="auto"/>
-        <w:ind w:firstLine="420"/>
-      </w:pPr>
-      <w:r>
-        <w:rPr>
-          <w:rFonts w:ascii="宋体" w:hAnsi="宋体" w:eastAsia="宋体"/>
-          <w:b w:val="0"/>
-          <w:sz w:val="24"/>
-        </w:rPr>
-        <w:t>本制度由总经办负责解释并组织实施。</w:t>
-      </w:r>
-    </w:p>
-    <w:p>
-      <w:pPr>
-        <w:spacing w:before="160" w:after="80"/>
-      </w:pPr>
-      <w:r>
-        <w:rPr>
-          <w:rFonts w:ascii="黑体" w:hAnsi="黑体" w:eastAsia="黑体"/>
-          <w:b/>
-          <w:sz w:val="24"/>
-        </w:rPr>
-        <w:t>第二条</w:t>
-      </w:r>
-    </w:p>
-    <w:p>
-      <w:pPr>
-        <w:spacing w:before="40" w:after="40" w:line="360" w:lineRule="auto"/>
-        <w:ind w:firstLine="420"/>
-      </w:pPr>
-      <w:r>
-        <w:rPr>
-          <w:rFonts w:ascii="宋体" w:hAnsi="宋体" w:eastAsia="宋体"/>
-          <w:b w:val="0"/>
-          <w:sz w:val="24"/>
-        </w:rPr>
-        <w:t>本制度自发布之日起施行。如与公司其他制度不一致的，涉及专项考核事项的，以本制度为准；其他事项仍按公司相关制度执行。</w:t>
-      </w:r>
-    </w:p>
-    <w:p>
-      <w:pPr>
-        <w:spacing w:before="720"/>
+        <w:spacing w:before="600"/>
         <w:jc w:val="right"/>
       </w:pPr>
       <w:r>
@@ -1163,7 +352,7 @@
     </w:p>
     <w:p>
       <w:pPr>
-        <w:spacing w:before="120" w:after="360"/>
+        <w:spacing w:after="360"/>
         <w:jc w:val="center"/>
       </w:pPr>
       <w:r>
@@ -1182,21 +371,19 @@
         <w:tblLook w:firstColumn="1" w:firstRow="1" w:lastColumn="0" w:lastRow="0" w:noHBand="0" w:noVBand="1" w:val="04A0"/>
       </w:tblPr>
       <w:tblGrid>
-        <w:gridCol w:w="873"/>
-        <w:gridCol w:w="873"/>
-        <w:gridCol w:w="873"/>
-        <w:gridCol w:w="873"/>
-        <w:gridCol w:w="873"/>
-        <w:gridCol w:w="873"/>
-        <w:gridCol w:w="873"/>
-        <w:gridCol w:w="873"/>
-        <w:gridCol w:w="873"/>
-        <w:gridCol w:w="873"/>
+        <w:gridCol w:w="1091"/>
+        <w:gridCol w:w="1091"/>
+        <w:gridCol w:w="1091"/>
+        <w:gridCol w:w="1091"/>
+        <w:gridCol w:w="1091"/>
+        <w:gridCol w:w="1091"/>
+        <w:gridCol w:w="1091"/>
+        <w:gridCol w:w="1091"/>
       </w:tblGrid>
       <w:tr>
         <w:tc>
           <w:tcPr>
-            <w:tcW w:type="dxa" w:w="873"/>
+            <w:tcW w:type="dxa" w:w="1091"/>
           </w:tcPr>
           <w:p>
             <w:pPr>
@@ -1206,7 +393,7 @@
               <w:rPr>
                 <w:rFonts w:ascii="黑体" w:hAnsi="黑体" w:eastAsia="黑体"/>
                 <w:b/>
-                <w:sz w:val="18"/>
+                <w:sz w:val="20"/>
               </w:rPr>
               <w:t>序号</w:t>
             </w:r>
@@ -1214,7 +401,7 @@
         </w:tc>
         <w:tc>
           <w:tcPr>
-            <w:tcW w:type="dxa" w:w="873"/>
+            <w:tcW w:type="dxa" w:w="1091"/>
           </w:tcPr>
           <w:p>
             <w:pPr>
@@ -1224,7 +411,7 @@
               <w:rPr>
                 <w:rFonts w:ascii="黑体" w:hAnsi="黑体" w:eastAsia="黑体"/>
                 <w:b/>
-                <w:sz w:val="18"/>
+                <w:sz w:val="20"/>
               </w:rPr>
               <w:t>事项名称</w:t>
             </w:r>
@@ -1232,7 +419,7 @@
         </w:tc>
         <w:tc>
           <w:tcPr>
-            <w:tcW w:type="dxa" w:w="873"/>
+            <w:tcW w:type="dxa" w:w="1091"/>
           </w:tcPr>
           <w:p>
             <w:pPr>
@@ -1242,7 +429,7 @@
               <w:rPr>
                 <w:rFonts w:ascii="黑体" w:hAnsi="黑体" w:eastAsia="黑体"/>
                 <w:b/>
-                <w:sz w:val="18"/>
+                <w:sz w:val="20"/>
               </w:rPr>
               <w:t>事项来源</w:t>
             </w:r>
@@ -1250,7 +437,7 @@
         </w:tc>
         <w:tc>
           <w:tcPr>
-            <w:tcW w:type="dxa" w:w="873"/>
+            <w:tcW w:type="dxa" w:w="1091"/>
           </w:tcPr>
           <w:p>
             <w:pPr>
@@ -1260,15 +447,15 @@
               <w:rPr>
                 <w:rFonts w:ascii="黑体" w:hAnsi="黑体" w:eastAsia="黑体"/>
                 <w:b/>
-                <w:sz w:val="18"/>
+                <w:sz w:val="20"/>
               </w:rPr>
-              <w:t>责任部门</w:t>
+              <w:t>责任人</w:t>
             </w:r>
           </w:p>
         </w:tc>
         <w:tc>
           <w:tcPr>
-            <w:tcW w:type="dxa" w:w="873"/>
+            <w:tcW w:type="dxa" w:w="1091"/>
           </w:tcPr>
           <w:p>
             <w:pPr>
@@ -1278,15 +465,15 @@
               <w:rPr>
                 <w:rFonts w:ascii="黑体" w:hAnsi="黑体" w:eastAsia="黑体"/>
                 <w:b/>
-                <w:sz w:val="18"/>
+                <w:sz w:val="20"/>
               </w:rPr>
-              <w:t>责任人</w:t>
+              <w:t>完成时间</w:t>
             </w:r>
           </w:p>
         </w:tc>
         <w:tc>
           <w:tcPr>
-            <w:tcW w:type="dxa" w:w="873"/>
+            <w:tcW w:type="dxa" w:w="1091"/>
           </w:tcPr>
           <w:p>
             <w:pPr>
@@ -1296,15 +483,15 @@
               <w:rPr>
                 <w:rFonts w:ascii="黑体" w:hAnsi="黑体" w:eastAsia="黑体"/>
                 <w:b/>
-                <w:sz w:val="18"/>
+                <w:sz w:val="20"/>
               </w:rPr>
-              <w:t>完成时间</w:t>
+              <w:t>完成标准</w:t>
             </w:r>
           </w:p>
         </w:tc>
         <w:tc>
           <w:tcPr>
-            <w:tcW w:type="dxa" w:w="873"/>
+            <w:tcW w:type="dxa" w:w="1091"/>
           </w:tcPr>
           <w:p>
             <w:pPr>
@@ -1314,15 +501,15 @@
               <w:rPr>
                 <w:rFonts w:ascii="黑体" w:hAnsi="黑体" w:eastAsia="黑体"/>
                 <w:b/>
-                <w:sz w:val="18"/>
+                <w:sz w:val="20"/>
               </w:rPr>
-              <w:t>完成标准</w:t>
+              <w:t>当前状态</w:t>
             </w:r>
           </w:p>
         </w:tc>
         <w:tc>
           <w:tcPr>
-            <w:tcW w:type="dxa" w:w="873"/>
+            <w:tcW w:type="dxa" w:w="1091"/>
           </w:tcPr>
           <w:p>
             <w:pPr>
@@ -1332,45 +519,9 @@
               <w:rPr>
                 <w:rFonts w:ascii="黑体" w:hAnsi="黑体" w:eastAsia="黑体"/>
                 <w:b/>
-                <w:sz w:val="18"/>
-              </w:rPr>
-              <w:t>当前状态</w:t>
-            </w:r>
-          </w:p>
-        </w:tc>
-        <w:tc>
-          <w:tcPr>
-            <w:tcW w:type="dxa" w:w="873"/>
-          </w:tcPr>
-          <w:p>
-            <w:pPr>
-              <w:jc w:val="center"/>
-            </w:pPr>
-            <w:r>
-              <w:rPr>
-                <w:rFonts w:ascii="黑体" w:hAnsi="黑体" w:eastAsia="黑体"/>
-                <w:b/>
-                <w:sz w:val="18"/>
+                <w:sz w:val="20"/>
               </w:rPr>
               <w:t>考核结果</w:t>
-            </w:r>
-          </w:p>
-        </w:tc>
-        <w:tc>
-          <w:tcPr>
-            <w:tcW w:type="dxa" w:w="873"/>
-          </w:tcPr>
-          <w:p>
-            <w:pPr>
-              <w:jc w:val="center"/>
-            </w:pPr>
-            <w:r>
-              <w:rPr>
-                <w:rFonts w:ascii="黑体" w:hAnsi="黑体" w:eastAsia="黑体"/>
-                <w:b/>
-                <w:sz w:val="18"/>
-              </w:rPr>
-              <w:t>备注</w:t>
             </w:r>
           </w:p>
         </w:tc>
@@ -1378,61 +529,49 @@
       <w:tr>
         <w:tc>
           <w:tcPr>
-            <w:tcW w:type="dxa" w:w="873"/>
+            <w:tcW w:type="dxa" w:w="1091"/>
           </w:tcPr>
           <w:p/>
         </w:tc>
         <w:tc>
           <w:tcPr>
-            <w:tcW w:type="dxa" w:w="873"/>
+            <w:tcW w:type="dxa" w:w="1091"/>
           </w:tcPr>
           <w:p/>
         </w:tc>
         <w:tc>
           <w:tcPr>
-            <w:tcW w:type="dxa" w:w="873"/>
+            <w:tcW w:type="dxa" w:w="1091"/>
           </w:tcPr>
           <w:p/>
         </w:tc>
         <w:tc>
           <w:tcPr>
-            <w:tcW w:type="dxa" w:w="873"/>
+            <w:tcW w:type="dxa" w:w="1091"/>
           </w:tcPr>
           <w:p/>
         </w:tc>
         <w:tc>
           <w:tcPr>
-            <w:tcW w:type="dxa" w:w="873"/>
+            <w:tcW w:type="dxa" w:w="1091"/>
           </w:tcPr>
           <w:p/>
         </w:tc>
         <w:tc>
           <w:tcPr>
-            <w:tcW w:type="dxa" w:w="873"/>
+            <w:tcW w:type="dxa" w:w="1091"/>
           </w:tcPr>
           <w:p/>
         </w:tc>
         <w:tc>
           <w:tcPr>
-            <w:tcW w:type="dxa" w:w="873"/>
+            <w:tcW w:type="dxa" w:w="1091"/>
           </w:tcPr>
           <w:p/>
         </w:tc>
         <w:tc>
           <w:tcPr>
-            <w:tcW w:type="dxa" w:w="873"/>
-          </w:tcPr>
-          <w:p/>
-        </w:tc>
-        <w:tc>
-          <w:tcPr>
-            <w:tcW w:type="dxa" w:w="873"/>
-          </w:tcPr>
-          <w:p/>
-        </w:tc>
-        <w:tc>
-          <w:tcPr>
-            <w:tcW w:type="dxa" w:w="873"/>
+            <w:tcW w:type="dxa" w:w="1091"/>
           </w:tcPr>
           <w:p/>
         </w:tc>
@@ -1440,61 +579,49 @@
       <w:tr>
         <w:tc>
           <w:tcPr>
-            <w:tcW w:type="dxa" w:w="873"/>
+            <w:tcW w:type="dxa" w:w="1091"/>
           </w:tcPr>
           <w:p/>
         </w:tc>
         <w:tc>
           <w:tcPr>
-            <w:tcW w:type="dxa" w:w="873"/>
+            <w:tcW w:type="dxa" w:w="1091"/>
           </w:tcPr>
           <w:p/>
         </w:tc>
         <w:tc>
           <w:tcPr>
-            <w:tcW w:type="dxa" w:w="873"/>
+            <w:tcW w:type="dxa" w:w="1091"/>
           </w:tcPr>
           <w:p/>
         </w:tc>
         <w:tc>
           <w:tcPr>
-            <w:tcW w:type="dxa" w:w="873"/>
+            <w:tcW w:type="dxa" w:w="1091"/>
           </w:tcPr>
           <w:p/>
         </w:tc>
         <w:tc>
           <w:tcPr>
-            <w:tcW w:type="dxa" w:w="873"/>
+            <w:tcW w:type="dxa" w:w="1091"/>
           </w:tcPr>
           <w:p/>
         </w:tc>
         <w:tc>
           <w:tcPr>
-            <w:tcW w:type="dxa" w:w="873"/>
+            <w:tcW w:type="dxa" w:w="1091"/>
           </w:tcPr>
           <w:p/>
         </w:tc>
         <w:tc>
           <w:tcPr>
-            <w:tcW w:type="dxa" w:w="873"/>
+            <w:tcW w:type="dxa" w:w="1091"/>
           </w:tcPr>
           <w:p/>
         </w:tc>
         <w:tc>
           <w:tcPr>
-            <w:tcW w:type="dxa" w:w="873"/>
-          </w:tcPr>
-          <w:p/>
-        </w:tc>
-        <w:tc>
-          <w:tcPr>
-            <w:tcW w:type="dxa" w:w="873"/>
-          </w:tcPr>
-          <w:p/>
-        </w:tc>
-        <w:tc>
-          <w:tcPr>
-            <w:tcW w:type="dxa" w:w="873"/>
+            <w:tcW w:type="dxa" w:w="1091"/>
           </w:tcPr>
           <w:p/>
         </w:tc>
@@ -1502,61 +629,49 @@
       <w:tr>
         <w:tc>
           <w:tcPr>
-            <w:tcW w:type="dxa" w:w="873"/>
+            <w:tcW w:type="dxa" w:w="1091"/>
           </w:tcPr>
           <w:p/>
         </w:tc>
         <w:tc>
           <w:tcPr>
-            <w:tcW w:type="dxa" w:w="873"/>
+            <w:tcW w:type="dxa" w:w="1091"/>
           </w:tcPr>
           <w:p/>
         </w:tc>
         <w:tc>
           <w:tcPr>
-            <w:tcW w:type="dxa" w:w="873"/>
+            <w:tcW w:type="dxa" w:w="1091"/>
           </w:tcPr>
           <w:p/>
         </w:tc>
         <w:tc>
           <w:tcPr>
-            <w:tcW w:type="dxa" w:w="873"/>
+            <w:tcW w:type="dxa" w:w="1091"/>
           </w:tcPr>
           <w:p/>
         </w:tc>
         <w:tc>
           <w:tcPr>
-            <w:tcW w:type="dxa" w:w="873"/>
+            <w:tcW w:type="dxa" w:w="1091"/>
           </w:tcPr>
           <w:p/>
         </w:tc>
         <w:tc>
           <w:tcPr>
-            <w:tcW w:type="dxa" w:w="873"/>
+            <w:tcW w:type="dxa" w:w="1091"/>
           </w:tcPr>
           <w:p/>
         </w:tc>
         <w:tc>
           <w:tcPr>
-            <w:tcW w:type="dxa" w:w="873"/>
+            <w:tcW w:type="dxa" w:w="1091"/>
           </w:tcPr>
           <w:p/>
         </w:tc>
         <w:tc>
           <w:tcPr>
-            <w:tcW w:type="dxa" w:w="873"/>
-          </w:tcPr>
-          <w:p/>
-        </w:tc>
-        <w:tc>
-          <w:tcPr>
-            <w:tcW w:type="dxa" w:w="873"/>
-          </w:tcPr>
-          <w:p/>
-        </w:tc>
-        <w:tc>
-          <w:tcPr>
-            <w:tcW w:type="dxa" w:w="873"/>
+            <w:tcW w:type="dxa" w:w="1091"/>
           </w:tcPr>
           <w:p/>
         </w:tc>
@@ -1564,61 +679,49 @@
       <w:tr>
         <w:tc>
           <w:tcPr>
-            <w:tcW w:type="dxa" w:w="873"/>
+            <w:tcW w:type="dxa" w:w="1091"/>
           </w:tcPr>
           <w:p/>
         </w:tc>
         <w:tc>
           <w:tcPr>
-            <w:tcW w:type="dxa" w:w="873"/>
+            <w:tcW w:type="dxa" w:w="1091"/>
           </w:tcPr>
           <w:p/>
         </w:tc>
         <w:tc>
           <w:tcPr>
-            <w:tcW w:type="dxa" w:w="873"/>
+            <w:tcW w:type="dxa" w:w="1091"/>
           </w:tcPr>
           <w:p/>
         </w:tc>
         <w:tc>
           <w:tcPr>
-            <w:tcW w:type="dxa" w:w="873"/>
+            <w:tcW w:type="dxa" w:w="1091"/>
           </w:tcPr>
           <w:p/>
         </w:tc>
         <w:tc>
           <w:tcPr>
-            <w:tcW w:type="dxa" w:w="873"/>
+            <w:tcW w:type="dxa" w:w="1091"/>
           </w:tcPr>
           <w:p/>
         </w:tc>
         <w:tc>
           <w:tcPr>
-            <w:tcW w:type="dxa" w:w="873"/>
+            <w:tcW w:type="dxa" w:w="1091"/>
           </w:tcPr>
           <w:p/>
         </w:tc>
         <w:tc>
           <w:tcPr>
-            <w:tcW w:type="dxa" w:w="873"/>
+            <w:tcW w:type="dxa" w:w="1091"/>
           </w:tcPr>
           <w:p/>
         </w:tc>
         <w:tc>
           <w:tcPr>
-            <w:tcW w:type="dxa" w:w="873"/>
-          </w:tcPr>
-          <w:p/>
-        </w:tc>
-        <w:tc>
-          <w:tcPr>
-            <w:tcW w:type="dxa" w:w="873"/>
-          </w:tcPr>
-          <w:p/>
-        </w:tc>
-        <w:tc>
-          <w:tcPr>
-            <w:tcW w:type="dxa" w:w="873"/>
+            <w:tcW w:type="dxa" w:w="1091"/>
           </w:tcPr>
           <w:p/>
         </w:tc>
@@ -1626,61 +729,49 @@
       <w:tr>
         <w:tc>
           <w:tcPr>
-            <w:tcW w:type="dxa" w:w="873"/>
+            <w:tcW w:type="dxa" w:w="1091"/>
           </w:tcPr>
           <w:p/>
         </w:tc>
         <w:tc>
           <w:tcPr>
-            <w:tcW w:type="dxa" w:w="873"/>
+            <w:tcW w:type="dxa" w:w="1091"/>
           </w:tcPr>
           <w:p/>
         </w:tc>
         <w:tc>
           <w:tcPr>
-            <w:tcW w:type="dxa" w:w="873"/>
+            <w:tcW w:type="dxa" w:w="1091"/>
           </w:tcPr>
           <w:p/>
         </w:tc>
         <w:tc>
           <w:tcPr>
-            <w:tcW w:type="dxa" w:w="873"/>
+            <w:tcW w:type="dxa" w:w="1091"/>
           </w:tcPr>
           <w:p/>
         </w:tc>
         <w:tc>
           <w:tcPr>
-            <w:tcW w:type="dxa" w:w="873"/>
+            <w:tcW w:type="dxa" w:w="1091"/>
           </w:tcPr>
           <w:p/>
         </w:tc>
         <w:tc>
           <w:tcPr>
-            <w:tcW w:type="dxa" w:w="873"/>
+            <w:tcW w:type="dxa" w:w="1091"/>
           </w:tcPr>
           <w:p/>
         </w:tc>
         <w:tc>
           <w:tcPr>
-            <w:tcW w:type="dxa" w:w="873"/>
+            <w:tcW w:type="dxa" w:w="1091"/>
           </w:tcPr>
           <w:p/>
         </w:tc>
         <w:tc>
           <w:tcPr>
-            <w:tcW w:type="dxa" w:w="873"/>
-          </w:tcPr>
-          <w:p/>
-        </w:tc>
-        <w:tc>
-          <w:tcPr>
-            <w:tcW w:type="dxa" w:w="873"/>
-          </w:tcPr>
-          <w:p/>
-        </w:tc>
-        <w:tc>
-          <w:tcPr>
-            <w:tcW w:type="dxa" w:w="873"/>
+            <w:tcW w:type="dxa" w:w="1091"/>
           </w:tcPr>
           <w:p/>
         </w:tc>
@@ -1688,185 +779,49 @@
       <w:tr>
         <w:tc>
           <w:tcPr>
-            <w:tcW w:type="dxa" w:w="873"/>
+            <w:tcW w:type="dxa" w:w="1091"/>
           </w:tcPr>
           <w:p/>
         </w:tc>
         <w:tc>
           <w:tcPr>
-            <w:tcW w:type="dxa" w:w="873"/>
+            <w:tcW w:type="dxa" w:w="1091"/>
           </w:tcPr>
           <w:p/>
         </w:tc>
         <w:tc>
           <w:tcPr>
-            <w:tcW w:type="dxa" w:w="873"/>
+            <w:tcW w:type="dxa" w:w="1091"/>
           </w:tcPr>
           <w:p/>
         </w:tc>
         <w:tc>
           <w:tcPr>
-            <w:tcW w:type="dxa" w:w="873"/>
+            <w:tcW w:type="dxa" w:w="1091"/>
           </w:tcPr>
           <w:p/>
         </w:tc>
         <w:tc>
           <w:tcPr>
-            <w:tcW w:type="dxa" w:w="873"/>
+            <w:tcW w:type="dxa" w:w="1091"/>
           </w:tcPr>
           <w:p/>
         </w:tc>
         <w:tc>
           <w:tcPr>
-            <w:tcW w:type="dxa" w:w="873"/>
+            <w:tcW w:type="dxa" w:w="1091"/>
           </w:tcPr>
           <w:p/>
         </w:tc>
         <w:tc>
           <w:tcPr>
-            <w:tcW w:type="dxa" w:w="873"/>
+            <w:tcW w:type="dxa" w:w="1091"/>
           </w:tcPr>
           <w:p/>
         </w:tc>
         <w:tc>
           <w:tcPr>
-            <w:tcW w:type="dxa" w:w="873"/>
-          </w:tcPr>
-          <w:p/>
-        </w:tc>
-        <w:tc>
-          <w:tcPr>
-            <w:tcW w:type="dxa" w:w="873"/>
-          </w:tcPr>
-          <w:p/>
-        </w:tc>
-        <w:tc>
-          <w:tcPr>
-            <w:tcW w:type="dxa" w:w="873"/>
-          </w:tcPr>
-          <w:p/>
-        </w:tc>
-      </w:tr>
-      <w:tr>
-        <w:tc>
-          <w:tcPr>
-            <w:tcW w:type="dxa" w:w="873"/>
-          </w:tcPr>
-          <w:p/>
-        </w:tc>
-        <w:tc>
-          <w:tcPr>
-            <w:tcW w:type="dxa" w:w="873"/>
-          </w:tcPr>
-          <w:p/>
-        </w:tc>
-        <w:tc>
-          <w:tcPr>
-            <w:tcW w:type="dxa" w:w="873"/>
-          </w:tcPr>
-          <w:p/>
-        </w:tc>
-        <w:tc>
-          <w:tcPr>
-            <w:tcW w:type="dxa" w:w="873"/>
-          </w:tcPr>
-          <w:p/>
-        </w:tc>
-        <w:tc>
-          <w:tcPr>
-            <w:tcW w:type="dxa" w:w="873"/>
-          </w:tcPr>
-          <w:p/>
-        </w:tc>
-        <w:tc>
-          <w:tcPr>
-            <w:tcW w:type="dxa" w:w="873"/>
-          </w:tcPr>
-          <w:p/>
-        </w:tc>
-        <w:tc>
-          <w:tcPr>
-            <w:tcW w:type="dxa" w:w="873"/>
-          </w:tcPr>
-          <w:p/>
-        </w:tc>
-        <w:tc>
-          <w:tcPr>
-            <w:tcW w:type="dxa" w:w="873"/>
-          </w:tcPr>
-          <w:p/>
-        </w:tc>
-        <w:tc>
-          <w:tcPr>
-            <w:tcW w:type="dxa" w:w="873"/>
-          </w:tcPr>
-          <w:p/>
-        </w:tc>
-        <w:tc>
-          <w:tcPr>
-            <w:tcW w:type="dxa" w:w="873"/>
-          </w:tcPr>
-          <w:p/>
-        </w:tc>
-      </w:tr>
-      <w:tr>
-        <w:tc>
-          <w:tcPr>
-            <w:tcW w:type="dxa" w:w="873"/>
-          </w:tcPr>
-          <w:p/>
-        </w:tc>
-        <w:tc>
-          <w:tcPr>
-            <w:tcW w:type="dxa" w:w="873"/>
-          </w:tcPr>
-          <w:p/>
-        </w:tc>
-        <w:tc>
-          <w:tcPr>
-            <w:tcW w:type="dxa" w:w="873"/>
-          </w:tcPr>
-          <w:p/>
-        </w:tc>
-        <w:tc>
-          <w:tcPr>
-            <w:tcW w:type="dxa" w:w="873"/>
-          </w:tcPr>
-          <w:p/>
-        </w:tc>
-        <w:tc>
-          <w:tcPr>
-            <w:tcW w:type="dxa" w:w="873"/>
-          </w:tcPr>
-          <w:p/>
-        </w:tc>
-        <w:tc>
-          <w:tcPr>
-            <w:tcW w:type="dxa" w:w="873"/>
-          </w:tcPr>
-          <w:p/>
-        </w:tc>
-        <w:tc>
-          <w:tcPr>
-            <w:tcW w:type="dxa" w:w="873"/>
-          </w:tcPr>
-          <w:p/>
-        </w:tc>
-        <w:tc>
-          <w:tcPr>
-            <w:tcW w:type="dxa" w:w="873"/>
-          </w:tcPr>
-          <w:p/>
-        </w:tc>
-        <w:tc>
-          <w:tcPr>
-            <w:tcW w:type="dxa" w:w="873"/>
-          </w:tcPr>
-          <w:p/>
-        </w:tc>
-        <w:tc>
-          <w:tcPr>
-            <w:tcW w:type="dxa" w:w="873"/>
+            <w:tcW w:type="dxa" w:w="1091"/>
           </w:tcPr>
           <w:p/>
         </w:tc>
@@ -1874,21 +829,8 @@
     </w:tbl>
     <w:p>
       <w:pPr>
-        <w:spacing w:before="240"/>
-      </w:pPr>
-      <w:r>
-        <w:rPr>
-          <w:rFonts w:ascii="黑体" w:hAnsi="黑体" w:eastAsia="黑体"/>
-          <w:b/>
-          <w:sz w:val="20"/>
-        </w:rPr>
-        <w:t>填表说明：</w:t>
-      </w:r>
-    </w:p>
-    <w:p>
-      <w:pPr>
-        <w:spacing w:before="20" w:after="20" w:line="360" w:lineRule="auto"/>
-        <w:ind w:firstLine="420"/>
+        <w:spacing w:line="360" w:lineRule="auto" w:before="40" w:after="40"/>
+        <w:ind w:firstLine="0"/>
       </w:pPr>
       <w:r>
         <w:rPr>
@@ -1896,13 +838,13 @@
           <w:b w:val="0"/>
           <w:sz w:val="24"/>
         </w:rPr>
-        <w:t>1. 事项来源填写：总经理交办 / 经营重大事项 / 管理层例会 / 执行例会 / 其他（需注明）。</w:t>
+        <w:t>事项来源：总经理交办 / 经营重大事项 / 管理层例会 / 执行例会。</w:t>
       </w:r>
     </w:p>
     <w:p>
       <w:pPr>
-        <w:spacing w:before="20" w:after="20" w:line="360" w:lineRule="auto"/>
-        <w:ind w:firstLine="420"/>
+        <w:spacing w:line="360" w:lineRule="auto" w:before="40" w:after="40"/>
+        <w:ind w:firstLine="0"/>
       </w:pPr>
       <w:r>
         <w:rPr>
@@ -1910,13 +852,13 @@
           <w:b w:val="0"/>
           <w:sz w:val="24"/>
         </w:rPr>
-        <w:t>2. 当前状态填写：推进中 / 已按期完成 / 逾期未完成 / 已重新匹配时间 / 已销项 等。</w:t>
+        <w:t>当前状态：推进中 / 已完成 / 逾期未完成 / 已重新匹配时间 / 已销项。</w:t>
       </w:r>
     </w:p>
     <w:p>
       <w:pPr>
-        <w:spacing w:before="20" w:after="20" w:line="360" w:lineRule="auto"/>
-        <w:ind w:firstLine="420"/>
+        <w:spacing w:line="360" w:lineRule="auto" w:before="40" w:after="40"/>
+        <w:ind w:firstLine="0"/>
       </w:pPr>
       <w:r>
         <w:rPr>
@@ -1924,21 +866,7 @@
           <w:b w:val="0"/>
           <w:sz w:val="24"/>
         </w:rPr>
-        <w:t>3. 考核结果填写：无 / 考核300元 / 降薪（注明幅度） / 申诉减免 等。</w:t>
-      </w:r>
-    </w:p>
-    <w:p>
-      <w:pPr>
-        <w:spacing w:before="20" w:after="20" w:line="360" w:lineRule="auto"/>
-        <w:ind w:firstLine="420"/>
-      </w:pPr>
-      <w:r>
-        <w:rPr>
-          <w:rFonts w:ascii="宋体" w:hAnsi="宋体" w:eastAsia="宋体"/>
-          <w:b w:val="0"/>
-          <w:sz w:val="24"/>
-        </w:rPr>
-        <w:t>4. 本清单一事一列，由总经办动态维护，报总经理审批后执行。</w:t>
+        <w:t>考核结果：无 / 考核300元 / 降薪 / 申诉减免。</w:t>
       </w:r>
     </w:p>
     <w:sectPr>

</xml_diff>